<commit_message>
R9 WIP checkpoint: V2 production cutover, physical tape validation pending
</commit_message>
<xml_diff>
--- a/docs/2068-Leap_Whats_New_Release_1_Beta.docx
+++ b/docs/2068-Leap_Whats_New_Release_1_Beta.docx
@@ -33,12 +33,32 @@
         <w:rPr>
           <w:i/>
         </w:rPr>
-        <w:t>2026-09-01</w:t>
+        <w:t>2026-09-27</w:t>
       </w:r>
     </w:p>
     <w:p>
       <w:r>
         <w:br w:type="page"/>
+      </w:r>
+    </w:p>
+    <w:p>
+      <w:r>
+        <w:t xml:space="preserve">&gt; </w:t>
+      </w:r>
+      <w:r>
+        <w:rPr>
+          <w:b/>
+        </w:rPr>
+        <w:t>Historical V1 change log:</w:t>
+      </w:r>
+      <w:r>
+        <w:t xml:space="preserve"> this document describes the earlier V1 &gt; production build. Current production is the R9 Architecture B V2 system, &gt; with MODE, SPRITE, PRINTER, and SHAPES packages. The optional V1 package &gt; list below is historical; see </w:t>
+      </w:r>
+      <w:r>
+        <w:t>`v2/R9_CUTOVER_LEDGER.md`</w:t>
+      </w:r>
+      <w:r>
+        <w:t xml:space="preserve"> &gt; for current behavior and measured status.</w:t>
       </w:r>
     </w:p>
     <w:p>

</xml_diff>